<commit_message>
Major lesson update: new BBC video, expanded grammar (conditionals/past simple/passive voice 15 exercises each), 3x longer reading texts, updated vocabulary
</commit_message>
<xml_diff>
--- a/notatki_korepetycje/Angielski/Electric Cars A2/Client_Materials.docx
+++ b/notatki_korepetycje/Angielski/Electric Cars A2/Client_Materials.docx
@@ -7,7 +7,7 @@
         <w:pStyle w:val="Title"/>
       </w:pPr>
       <w:r>
-        <w:t>Lesson Topic: Electric Cars and Global Shift (A2)</w:t>
+        <w:t>Lesson Topic: Electric Cars and the Global Shift (A2)</w:t>
       </w:r>
     </w:p>
     <w:p>
@@ -48,12 +48,12 @@
     </w:p>
     <w:p>
       <w:r>
-        <w:t>Network A Report: https://www.youtube.com/watch?v=kzsyJROQOas</w:t>
+        <w:t>Network A (BBC News) Report: https://www.youtube.com/watch?v=UKttFDnKSp8</w:t>
       </w:r>
     </w:p>
     <w:p>
       <w:r>
-        <w:t>Network B Report: https://www.youtube.com/watch?v=cT2-AJj0yfo</w:t>
+        <w:t>Network B (GreenCars 101) Report: https://www.youtube.com/watch?v=cT2-AJj0yfo</w:t>
       </w:r>
     </w:p>
     <w:p>
@@ -61,22 +61,22 @@
         <w:pStyle w:val="Heading2"/>
       </w:pPr>
       <w:r>
-        <w:t>Network A Questions</w:t>
+        <w:t>Network A (BBC News) Questions</w:t>
       </w:r>
     </w:p>
     <w:p>
       <w:r>
-        <w:t>1. What replaces the gas tank in an electric car?</w:t>
+        <w:t>1. Why are electric cars more expensive than regular cars?</w:t>
       </w:r>
     </w:p>
     <w:p>
       <w:r>
-        <w:t>2. How do people usually charge electric cars at home?</w:t>
+        <w:t>2. How long can it take to charge an electric car?</w:t>
       </w:r>
     </w:p>
     <w:p>
       <w:r>
-        <w:t>3. What happens when you press the pedal in an electric car?</w:t>
+        <w:t>3. What minerals are used to make EV batteries that can hurt the environment?</w:t>
       </w:r>
     </w:p>
     <w:p>
@@ -84,12 +84,12 @@
         <w:pStyle w:val="Heading2"/>
       </w:pPr>
       <w:r>
-        <w:t>Network B Questions</w:t>
+        <w:t>Network B (GreenCars 101) Questions</w:t>
       </w:r>
     </w:p>
     <w:p>
       <w:r>
-        <w:t>1. What is the main advantage of an electric motor?</w:t>
+        <w:t>1. What is the main advantage of owning an electric car?</w:t>
       </w:r>
     </w:p>
     <w:p>
@@ -99,7 +99,7 @@
     </w:p>
     <w:p>
       <w:r>
-        <w:t>3. Does an electric car have an exhaust pipe?</w:t>
+        <w:t>3. Does an electric car produce exhaust emissions?</w:t>
       </w:r>
     </w:p>
     <w:p>
@@ -107,20 +107,64 @@
         <w:pStyle w:val="Heading1"/>
       </w:pPr>
       <w:r>
-        <w:t>Grammar: First Conditional</w:t>
+        <w:t>Grammar: Conditionals (Zero, First, Second, Third &amp; Mixed)</w:t>
       </w:r>
     </w:p>
     <w:p>
       <w:r>
+        <w:t>ZERO CONDITIONAL: We use the Zero Conditional for general truths and scientific facts.</w:t>
+        <w:br/>
+        <w:t>Rule: If + Present Simple, Present Simple.</w:t>
+        <w:br/>
+        <w:t>Examples:</w:t>
+        <w:br/>
+        <w:t>- If you heat water to 100°C, it boils.</w:t>
+        <w:br/>
+        <w:t>- If an electric car runs out of charge, it stops.</w:t>
+        <w:br/>
+        <w:br/>
         <w:t>FIRST CONDITIONAL: We use the First Conditional to talk about a possible future action.</w:t>
         <w:br/>
         <w:t>Rule: If + Present Simple, will + verb.</w:t>
         <w:br/>
         <w:t>Examples:</w:t>
         <w:br/>
-        <w:t>- If you buy an EV, you will try to save money on gasoline.</w:t>
+        <w:t>- If you buy an EV, you will save money on gasoline.</w:t>
         <w:br/>
         <w:t>- If it rains, I will stay home.</w:t>
+        <w:br/>
+        <w:br/>
+        <w:t>SECOND CONDITIONAL: We use the Second Conditional for imaginary or unlikely present/future situations.</w:t>
+        <w:br/>
+        <w:t>Rule: If + Past Simple, would + verb.</w:t>
+        <w:br/>
+        <w:t>Examples:</w:t>
+        <w:br/>
+        <w:t>- If I had a million dollars, I would buy a Tesla.</w:t>
+        <w:br/>
+        <w:t>- If electric cars were cheaper, more people would buy them.</w:t>
+        <w:br/>
+        <w:br/>
+        <w:t>THIRD CONDITIONAL: We use the Third Conditional for imaginary past situations (things that did NOT happen).</w:t>
+        <w:br/>
+        <w:t>Rule: If + Past Perfect, would have + Past Participle.</w:t>
+        <w:br/>
+        <w:t>Examples:</w:t>
+        <w:br/>
+        <w:t>- If I had known about EVs earlier, I would have bought one sooner.</w:t>
+        <w:br/>
+        <w:t>- If they had built more chargers, more people would have switched to electric.</w:t>
+        <w:br/>
+        <w:br/>
+        <w:t>MIXED CONDITIONAL: We use Mixed Conditionals when one part is about the past and the other is about the present, or vice versa.</w:t>
+        <w:br/>
+        <w:t>Rule: If + Past Perfect, would + verb (past condition → present result).</w:t>
+        <w:br/>
+        <w:t>Examples:</w:t>
+        <w:br/>
+        <w:t>- If I had studied engineering, I would work at Tesla now.</w:t>
+        <w:br/>
+        <w:t>- If she had charged the car last night, she would not be stuck today.</w:t>
       </w:r>
     </w:p>
     <w:p>
@@ -133,17 +177,77 @@
     </w:p>
     <w:p>
       <w:r>
-        <w:t>1. If my car (break) down, I (call) a mechanic.</w:t>
+        <w:t>1. If my car (break) down, I (call) a mechanic. [First]</w:t>
       </w:r>
     </w:p>
     <w:p>
       <w:r>
-        <w:t>2. If you (drive) an electric car, you (not produce) exhaust gases.</w:t>
+        <w:t>2. If you (drive) an electric car, you (not produce) exhaust gases. [Zero]</w:t>
       </w:r>
     </w:p>
     <w:p>
       <w:r>
-        <w:t>3. We (spend) less money if we (charge) the car at home.</w:t>
+        <w:t>3. We (spend) less money if we (charge) the car at home. [First]</w:t>
+      </w:r>
+    </w:p>
+    <w:p>
+      <w:r>
+        <w:t>4. If I (be) the president, I (ban) all petrol cars. [Second]</w:t>
+      </w:r>
+    </w:p>
+    <w:p>
+      <w:r>
+        <w:t>5. If they (invest) in solar energy last year, the factory (be) greener today. [Mixed]</w:t>
+      </w:r>
+    </w:p>
+    <w:p>
+      <w:r>
+        <w:t>6. If you (leave) the lights on, the battery (die). [Zero]</w:t>
+      </w:r>
+    </w:p>
+    <w:p>
+      <w:r>
+        <w:t>7. If she (have) enough money, she (buy) an electric car tomorrow. [First]</w:t>
+      </w:r>
+    </w:p>
+    <w:p>
+      <w:r>
+        <w:t>8. If we (not invent) the battery, electric cars (not exist). [Third]</w:t>
+      </w:r>
+    </w:p>
+    <w:p>
+      <w:r>
+        <w:t>9. If petrol (cost) $10 per litre, everyone (switch) to electric. [Second]</w:t>
+      </w:r>
+    </w:p>
+    <w:p>
+      <w:r>
+        <w:t>10. If they (build) a charging station here last year, we (not have) this problem now. [Mixed]</w:t>
+      </w:r>
+    </w:p>
+    <w:p>
+      <w:r>
+        <w:t>11. If the government (give) subsidies, more people (buy) EVs next year. [First]</w:t>
+      </w:r>
+    </w:p>
+    <w:p>
+      <w:r>
+        <w:t>12. If I (know) about the pollution, I (not buy) a diesel car back then. [Third]</w:t>
+      </w:r>
+    </w:p>
+    <w:p>
+      <w:r>
+        <w:t>13. If you (mix) hydrogen and oxygen, you (get) water. [Zero]</w:t>
+      </w:r>
+    </w:p>
+    <w:p>
+      <w:r>
+        <w:t>14. If electric cars (be) available in 1950, the world (be) very different now. [Mixed]</w:t>
+      </w:r>
+    </w:p>
+    <w:p>
+      <w:r>
+        <w:t>15. If the price of batteries (drop) by 50%, EVs (become) more affordable. [First]</w:t>
       </w:r>
     </w:p>
     <w:p>
@@ -156,52 +260,52 @@
     </w:p>
     <w:p>
       <w:r>
-        <w:t>Battery - A device that stores electricity.</w:t>
+        <w:t>Subsidies — Money from the government to help make something cheaper for people.</w:t>
       </w:r>
     </w:p>
     <w:p>
       <w:r>
-        <w:t>Engine - A machine that makes a car move.</w:t>
+        <w:t>Infrastructure — The basic systems and structures (roads, chargers, power lines) that a country needs.</w:t>
       </w:r>
     </w:p>
     <w:p>
       <w:r>
-        <w:t>Charge - To put electricity into a battery.</w:t>
+        <w:t>Electrification — The process of changing systems to run on electricity instead of fuel.</w:t>
       </w:r>
     </w:p>
     <w:p>
       <w:r>
-        <w:t>Distance - How far something is.</w:t>
+        <w:t>Extraction — The process of removing or taking out a natural resource from the earth.</w:t>
       </w:r>
     </w:p>
     <w:p>
       <w:r>
-        <w:t>Exhaust - The dirty gas that comes out of a car.</w:t>
+        <w:t>Deforestation — Cutting down or destroying large areas of forest.</w:t>
       </w:r>
     </w:p>
     <w:p>
       <w:r>
-        <w:t>Sales - The number of things that are sold.</w:t>
+        <w:t>Habitat — The natural home of an animal, plant, or other living thing.</w:t>
       </w:r>
     </w:p>
     <w:p>
       <w:r>
-        <w:t>Growth - The process of becoming larger or more.</w:t>
+        <w:t>Efficiency — How well something works without wasting energy or effort.</w:t>
       </w:r>
     </w:p>
     <w:p>
       <w:r>
-        <w:t>Global - Affecting the whole world.</w:t>
+        <w:t>Transition — The process of changing from one state or system to another.</w:t>
       </w:r>
     </w:p>
     <w:p>
       <w:r>
-        <w:t>Subsidies - Money from the government to help pay for something.</w:t>
+        <w:t>Consumer — A person who buys things.</w:t>
       </w:r>
     </w:p>
     <w:p>
       <w:r>
-        <w:t>Consumer - A person who buys things.</w:t>
+        <w:t>Emissions — Gases or substances released into the air, often from cars or factories.</w:t>
       </w:r>
     </w:p>
     <w:p>
@@ -214,7 +318,19 @@
     </w:p>
     <w:p>
       <w:r>
-        <w:t>Global electric vehicle sales reached a new milestone in 2024. More than 17 million units were sold, which was a 25 percent increase from the previous year. China was the biggest market, selling over 10 million electric cars. Many people in Europe and North America also bought electric cars. However, in early 2026, some companies saw a slowdown in sales. Experts say this is because governments reduced financial subsidies and because some drivers are worried about battery charging options on long journeys. If governments build more public chargers, more consumers will likely choose electric vehicles.</w:t>
+        <w:t>Global electric vehicle sales reached a new milestone in 2024. More than 17 million units were sold, which was a 25 percent increase from the previous year. China was the biggest market, selling over 10 million electric cars. Many people in Europe and North America also bought electric cars, helped by generous government subsidies and growing environmental awareness.</w:t>
+        <w:br/>
+        <w:br/>
+        <w:t>However, the road to full electrification is not without obstacles. One of the biggest challenges is the lack of charging infrastructure. While city centres often have plenty of charging stations, rural areas and smaller towns may have very few. This means that drivers who live outside major cities sometimes struggle to find a convenient place to charge their vehicles, especially during long road trips.</w:t>
+        <w:br/>
+        <w:br/>
+        <w:t>Another concern is the cost of manufacturing EV batteries. The raw materials needed — particularly lithium, cobalt, and nickel — are extracted through mining operations that can cause significant environmental damage, including deforestation, water pollution, and habitat destruction. Some critics argue that until these supply chain issues are resolved, electric cars cannot truly be called "green."</w:t>
+        <w:br/>
+        <w:br/>
+        <w:t>Despite these concerns, the technology is improving rapidly. Battery efficiency has increased dramatically over the past decade, and newer models can now travel over 500 kilometres on a single charge. Solid-state batteries, which promise even greater range and faster charging times, are expected to enter mass production within the next few years.</w:t>
+        <w:br/>
+        <w:br/>
+        <w:t xml:space="preserve">In early 2026, some companies saw a slowdown in sales. Experts say this is because governments reduced financial subsidies and because some drivers are worried about battery charging options on long journeys. However, analysts remain optimistic about the long-term outlook. If governments build more public chargers and invest in renewable energy, more consumers will likely choose electric vehicles. The transition to electric transport is not a question of "if" but "when." </w:t>
       </w:r>
     </w:p>
     <w:p>
@@ -223,7 +339,7 @@
           <w:color w:val="808080"/>
           <w:sz w:val="18"/>
         </w:rPr>
-        <w:t>Source: Adapted from Reuters Reports | Author: News Team | Date: March 2024</w:t>
+        <w:t>Source: Adapted from Reuters and IEA Reports | Author: News Team | Date: March 2024</w:t>
       </w:r>
     </w:p>
     <w:p>
@@ -246,7 +362,27 @@
     </w:p>
     <w:p>
       <w:r>
-        <w:t>3. What problem did some companies see in early 2026?</w:t>
+        <w:t>3. What is one of the biggest challenges for EV drivers in rural areas?</w:t>
+      </w:r>
+    </w:p>
+    <w:p>
+      <w:r>
+        <w:t>4. What raw materials are needed to make EV batteries?</w:t>
+      </w:r>
+    </w:p>
+    <w:p>
+      <w:r>
+        <w:t>5. What problem did some companies see in early 2026?</w:t>
+      </w:r>
+    </w:p>
+    <w:p>
+      <w:r>
+        <w:t>6. How far can newer EV models travel on a single charge?</w:t>
+      </w:r>
+    </w:p>
+    <w:p>
+      <w:r>
+        <w:t>7. What type of battery is expected to enter mass production soon?</w:t>
       </w:r>
     </w:p>
     <w:sectPr>

</xml_diff>